<commit_message>
fix issues with rendering of docx output
</commit_message>
<xml_diff>
--- a/_extensions/lboroPaper/word/reference.docx
+++ b/_extensions/lboroPaper/word/reference.docx
@@ -4350,7 +4350,6 @@
         <w:insideH w:val="single" w:sz="4" w:space="0" w:color="auto"/>
         <w:insideV w:val="single" w:sz="4" w:space="0" w:color="auto"/>
       </w:tblBorders>
-      <w:shd w:val="clear" w:color="auto" w:fill="E5DFEC" w:themeFill="accent4"/>
     </w:tblPr>
   </w:style>
   <w:style w:type="character" w:styleId="Mention">
@@ -4404,6 +4403,85 @@
       <w:sz w:val="22"/>
       <w:szCs w:val="24"/>
       <w:lang w:eastAsia="en-GB"/>
+    </w:rPr>
+  </w:style>
+  <w:style w:type="paragraph" w:customStyle="1" w:styleId="CommitteeBanner">
+    <w:name w:val="Committee Banner"/>
+    <w:basedOn w:val="Normal"/>
+    <w:pPr>
+      <w:spacing w:before="0" w:after="0"/>
+      <w:shd w:val="clear" w:color="auto" w:fill="5F497A"/>
+    </w:pPr>
+    <w:rPr>
+      <w:rFonts w:ascii="Arial" w:hAnsi="Arial"/>
+      <w:b/>
+      <w:color w:val="FFFFFF"/>
+      <w:sz w:val="32"/>
+    </w:rPr>
+  </w:style>
+  <w:style w:type="paragraph" w:customStyle="1" w:styleId="ActionRequiredHeading">
+    <w:name w:val="Action Required Heading"/>
+    <w:basedOn w:val="Normal"/>
+    <w:pPr>
+      <w:spacing w:before="100" w:after="0"/>
+      <w:shd w:val="clear" w:color="auto" w:fill="E5DFEC"/>
+      <w:pBdr>
+        <w:top w:val="single" w:sz="8" w:space="0" w:color="5F497A"/>
+        <w:left w:val="single" w:sz="8" w:space="0" w:color="5F497A"/>
+        <w:bottom w:val="single" w:sz="8" w:space="0" w:color="5F497A"/>
+        <w:right w:val="single" w:sz="8" w:space="0" w:color="5F497A"/>
+      </w:pBdr>
+    </w:pPr>
+    <w:rPr>
+      <w:rFonts w:ascii="Arial" w:hAnsi="Arial"/>
+      <w:b/>
+      <w:color w:val="000000"/>
+      <w:sz w:val="24"/>
+    </w:rPr>
+  </w:style>
+  <w:style w:type="paragraph" w:customStyle="1" w:styleId="ActionRequired">
+    <w:name w:val="Action Required"/>
+    <w:basedOn w:val="Normal"/>
+    <w:pPr>
+      <w:spacing w:before="0" w:after="100"/>
+      <w:shd w:val="clear" w:color="auto" w:fill="E5DFEC"/>
+      <w:pBdr>
+        <w:top w:val="single" w:sz="8" w:space="0" w:color="5F497A"/>
+        <w:left w:val="single" w:sz="8" w:space="0" w:color="5F497A"/>
+        <w:bottom w:val="single" w:sz="8" w:space="0" w:color="5F497A"/>
+        <w:right w:val="single" w:sz="8" w:space="0" w:color="5F497A"/>
+      </w:pBdr>
+    </w:pPr>
+    <w:rPr>
+      <w:rFonts w:ascii="Arial" w:hAnsi="Arial"/>
+      <w:color w:val="000000"/>
+      <w:sz w:val="24"/>
+    </w:rPr>
+  </w:style>
+  <w:style w:type="paragraph" w:customStyle="1" w:styleId="CommitteeSectionHeading">
+    <w:name w:val="Committee Section Heading"/>
+    <w:basedOn w:val="Normal"/>
+    <w:pPr>
+      <w:spacing w:before="0" w:after="0" w:line="360" w:lineRule="auto"/>
+    </w:pPr>
+    <w:rPr>
+      <w:rFonts w:ascii="Arial" w:hAnsi="Arial"/>
+      <w:b/>
+      <w:color w:val="000000"/>
+      <w:sz w:val="24"/>
+    </w:rPr>
+  </w:style>
+  <w:style w:type="paragraph" w:customStyle="1" w:styleId="CommitteeBodyHeading">
+    <w:name w:val="Committee Body Heading"/>
+    <w:basedOn w:val="Normal"/>
+    <w:pPr>
+      <w:spacing w:before="120" w:after="0" w:line="360" w:lineRule="auto"/>
+    </w:pPr>
+    <w:rPr>
+      <w:rFonts w:ascii="Arial" w:hAnsi="Arial"/>
+      <w:b/>
+      <w:color w:val="5F497A"/>
+      <w:sz w:val="24"/>
     </w:rPr>
   </w:style>
 </w:styles>

</xml_diff>